<commit_message>
docs: expand user manual with emergency system and troubleshooting
</commit_message>
<xml_diff>
--- a/docs/User_Manual.docx
+++ b/docs/User_Manual.docx
@@ -7,13 +7,13 @@
         <w:pStyle w:val="Title"/>
       </w:pPr>
       <w:r>
-        <w:t>🚌 BusGo: Comprehensive User Manual</w:t>
+        <w:t>🚌 BusGo: Elite Production-Ready User Manual</w:t>
       </w:r>
     </w:p>
     <w:p/>
     <w:p>
       <w:r>
-        <w:t>Welcome to the **BusGo** ecosystem, Sri Lanka's premier integrated bus management solution. This manual provides detailed instructions for passengers, drivers, conductors, and administrators.</w:t>
+        <w:t>Welcome to the **BusGo** ecosystem, Sri Lanka's most advanced integrated bus management solution. This comprehensive manual covers every module, database interaction, and intelligent feature within the production environment.</w:t>
       </w:r>
     </w:p>
     <w:p/>
@@ -28,7 +28,7 @@
         <w:pStyle w:val="Heading1"/>
       </w:pPr>
       <w:r>
-        <w:t>📋 Table of Contents</w:t>
+        <w:t>📋 Extended Table of Contents</w:t>
       </w:r>
     </w:p>
     <w:p>
@@ -36,7 +36,7 @@
         <w:pStyle w:val="ListNumber"/>
       </w:pPr>
       <w:r>
-        <w:t>[Introduction](#1-introduction)</w:t>
+        <w:t>[System Overview &amp; Architecture](#1-system-overview--architecture)</w:t>
       </w:r>
     </w:p>
     <w:p>
@@ -44,7 +44,7 @@
         <w:pStyle w:val="ListNumber"/>
       </w:pPr>
       <w:r>
-        <w:t>[Passenger Guide (BusGo Client)](#2-passenger-guide-busgo-client)</w:t>
+        <w:t>[Identity &amp; Access Management (Auth)](#2-identity--access-management-auth)</w:t>
       </w:r>
     </w:p>
     <w:p>
@@ -52,27 +52,42 @@
         <w:pStyle w:val="ListNumber"/>
       </w:pPr>
       <w:r>
-        <w:t>[Driver Guide (BusGo Drive)](#3-driver-guide-busgo-drive)</w:t>
+        <w:t>[Passenger Experience (BusGo Client)](#3-passenger-experience-busgo-client)</w:t>
       </w:r>
     </w:p>
     <w:p>
       <w:r>
-        <w:t>4. [Conductor Guide (BusGo Scanner)](#4-conductor-guide-busgo-scanner)</w:t>
+        <w:t>4. [Driver Operations (BusGo Drive)](#4-driver-operations-busgo-drive)</w:t>
       </w:r>
     </w:p>
     <w:p>
       <w:r>
-        <w:t>5. [Administrator Manual (BusGo Admin)](#5-administrator-manual-busgo-admin)</w:t>
+        <w:t>5. [Conductor &amp; Scanning (BusGo Scanner)](#5-conductor--scanning-busgo-scanner)</w:t>
       </w:r>
     </w:p>
     <w:p>
       <w:r>
-        <w:t>6. [Emergency &amp; Safety Features](#6-emergency--safety-features)</w:t>
+        <w:t>6. [The Neo Engine: AI &amp; Intelligent Features](#6-the-neo-engine-ai--intelligent-features)</w:t>
       </w:r>
     </w:p>
     <w:p>
       <w:r>
-        <w:t>7. [Troubleshooting &amp; Support](#7-troubleshooting--support)</w:t>
+        <w:t>7. [🚨 Emergency Alert &amp; Incident Response System](#7-emergency-alert--incident-response-system)</w:t>
+      </w:r>
+    </w:p>
+    <w:p>
+      <w:r>
+        <w:t>8. [Administrative Governance (BusGo Admin)](#8-administrative-governance-busgo-admin)</w:t>
+      </w:r>
+    </w:p>
+    <w:p>
+      <w:r>
+        <w:t>9. [Database &amp; Data Integrity](#9-database--data-integrity)</w:t>
+      </w:r>
+    </w:p>
+    <w:p>
+      <w:r>
+        <w:t>10. [🛠️ Technical Troubleshooting](#10-technical-troubleshooting)</w:t>
       </w:r>
     </w:p>
     <w:p/>
@@ -87,12 +102,12 @@
         <w:pStyle w:val="Heading1"/>
       </w:pPr>
       <w:r>
-        <w:t>1. Introduction</w:t>
+        <w:t>1. System Overview &amp; Architecture</w:t>
       </w:r>
     </w:p>
     <w:p>
       <w:r>
-        <w:t>BusGo is a multi-platform system designed to streamline public transport. By leveraging real-time GPS tracking, AI-powered predictive models (Neo Engine), and seamless QR-based transactions, BusGo ensures a reliable and efficient travel experience.</w:t>
+        <w:t>BusGo is built on a high-performance Node.js/Express backend, utilizing Supabase (PostgreSQL) for real-time data persistence and broadcasting. The system architecture is divided into 11 domain modules, ensuring modularity and elite efficiency.</w:t>
       </w:r>
     </w:p>
     <w:p/>
@@ -107,12 +122,12 @@
         <w:pStyle w:val="Heading1"/>
       </w:pPr>
       <w:r>
-        <w:t>2. Passenger Guide (BusGo Client)</w:t>
+        <w:t>2. Identity &amp; Access Management (Auth)</w:t>
       </w:r>
     </w:p>
     <w:p>
       <w:r>
-        <w:t>The BusGo Client app is your gateway to hassle-free travel.</w:t>
+        <w:t>Our security layer utilizes JWT with dual-token rotation (15-minute access, 7-day refresh).</w:t>
       </w:r>
     </w:p>
     <w:p/>
@@ -121,31 +136,40 @@
         <w:pStyle w:val="Heading2"/>
       </w:pPr>
       <w:r>
-        <w:t>2.1 Getting Started</w:t>
+        <w:t>2.1 Multi-Step Registration</w:t>
       </w:r>
     </w:p>
     <w:p>
       <w:pPr>
-        <w:pStyle w:val="ListNumber"/>
+        <w:pStyle w:val="ListBullet"/>
       </w:pPr>
       <w:r>
-        <w:t>**Installation:** Install the `busgo_client` Flutter application.</w:t>
+        <w:t>**Verification:** All users must verify their phone number and email.</w:t>
       </w:r>
     </w:p>
     <w:p>
       <w:pPr>
-        <w:pStyle w:val="ListNumber"/>
+        <w:pStyle w:val="ListBullet"/>
       </w:pPr>
       <w:r>
-        <w:t>**Registration:** Create an account using your email and phone number.</w:t>
+        <w:t>**Roles:** Membership types (Standard, Premium, etc.) are assigned during registration.</w:t>
+      </w:r>
+    </w:p>
+    <w:p/>
+    <w:p>
+      <w:pPr>
+        <w:pStyle w:val="Heading2"/>
+      </w:pPr>
+      <w:r>
+        <w:t>2.2 Secure PIN Reset</w:t>
       </w:r>
     </w:p>
     <w:p>
       <w:pPr>
-        <w:pStyle w:val="ListNumber"/>
+        <w:pStyle w:val="ListBullet"/>
       </w:pPr>
       <w:r>
-        <w:t>**Login:** Use your credentials to access the dashboard.</w:t>
+        <w:t>Uses a 3-step verification flow with SHA-256 hashed reset tokens and bcrypt-hashed 6-digit PINs.</w:t>
       </w:r>
     </w:p>
     <w:p/>
@@ -158,124 +182,7 @@
           <w:b/>
           <w:i/>
         </w:rPr>
-        <w:t>**[IMAGE: Passenger App Login Screen]**</w:t>
-      </w:r>
-    </w:p>
-    <w:p/>
-    <w:p>
-      <w:pPr>
-        <w:pStyle w:val="Heading2"/>
-      </w:pPr>
-      <w:r>
-        <w:t>2.2 Finding Your Bus</w:t>
-      </w:r>
-    </w:p>
-    <w:p>
-      <w:pPr>
-        <w:pStyle w:val="ListBullet"/>
-      </w:pPr>
-      <w:r>
-        <w:t>**Search:** Enter your destination in the search bar to find available routes (e.g., 138, 163).</w:t>
-      </w:r>
-    </w:p>
-    <w:p>
-      <w:pPr>
-        <w:pStyle w:val="ListBullet"/>
-      </w:pPr>
-      <w:r>
-        <w:t>**Nearby Stops:** View the closest bus stops based on your current location.</w:t>
-      </w:r>
-    </w:p>
-    <w:p>
-      <w:pPr>
-        <w:pStyle w:val="ListBullet"/>
-      </w:pPr>
-      <w:r>
-        <w:t>**Live Map:** Track buses in real-time and view their estimated time of arrival (ETA).</w:t>
-      </w:r>
-    </w:p>
-    <w:p/>
-    <w:p>
-      <w:pPr>
-        <w:ind w:left="360"/>
-      </w:pPr>
-      <w:r>
-        <w:rPr>
-          <w:b/>
-          <w:i/>
-        </w:rPr>
-        <w:t>**[IMAGE: Live Map with Bus Locations]**</w:t>
-      </w:r>
-    </w:p>
-    <w:p/>
-    <w:p>
-      <w:pPr>
-        <w:pStyle w:val="Heading2"/>
-      </w:pPr>
-      <w:r>
-        <w:t>2.3 Managing Your Trip</w:t>
-      </w:r>
-    </w:p>
-    <w:p>
-      <w:pPr>
-        <w:pStyle w:val="ListNumber"/>
-      </w:pPr>
-      <w:r>
-        <w:t>**Boarding:** Select "Start Trip" when you board the bus.</w:t>
-      </w:r>
-    </w:p>
-    <w:p>
-      <w:pPr>
-        <w:pStyle w:val="ListNumber"/>
-      </w:pPr>
-      <w:r>
-        <w:t>**Crowd Level:** Check the bus's crowd status (Low, Moderate, High) before boarding.</w:t>
-      </w:r>
-    </w:p>
-    <w:p>
-      <w:pPr>
-        <w:pStyle w:val="ListNumber"/>
-      </w:pPr>
-      <w:r>
-        <w:t>**Alighting:** Select "Alight Trip" when you reach your destination.</w:t>
-      </w:r>
-    </w:p>
-    <w:p/>
-    <w:p>
-      <w:pPr>
-        <w:pStyle w:val="Heading2"/>
-      </w:pPr>
-      <w:r>
-        <w:t>2.4 QR Card &amp; Payments</w:t>
-      </w:r>
-    </w:p>
-    <w:p>
-      <w:pPr>
-        <w:pStyle w:val="ListBullet"/>
-      </w:pPr>
-      <w:r>
-        <w:t>Access your unique **QR Card** from the profile menu.</w:t>
-      </w:r>
-    </w:p>
-    <w:p>
-      <w:pPr>
-        <w:pStyle w:val="ListBullet"/>
-      </w:pPr>
-      <w:r>
-        <w:t>Present this QR code to the conductor upon exiting to finalize your fare and trip.</w:t>
-      </w:r>
-    </w:p>
-    <w:p/>
-    <w:p>
-      <w:pPr>
-        <w:ind w:left="360"/>
-      </w:pPr>
-      <w:r>
-        <w:rPr>
-          <w:b/>
-          <w:i/>
-        </w:rPr>
-        <w:t>**[IMAGE: Passenger QR Card Display]**</w:t>
+        <w:t>**[IMAGE: Registration &amp; MFA Interface]**</w:t>
       </w:r>
     </w:p>
     <w:p/>
@@ -290,12 +197,12 @@
         <w:pStyle w:val="Heading1"/>
       </w:pPr>
       <w:r>
-        <w:t>3. Driver Guide (BusGo Drive)</w:t>
+        <w:t>3. Passenger Experience (BusGo Client)</w:t>
       </w:r>
     </w:p>
     <w:p>
       <w:r>
-        <w:t>The BusGo Drive app empowers drivers to provide accurate data to passengers.</w:t>
+        <w:t>Designed for the modern commuter in Colombo.</w:t>
       </w:r>
     </w:p>
     <w:p/>
@@ -304,7 +211,32 @@
         <w:pStyle w:val="Heading2"/>
       </w:pPr>
       <w:r>
-        <w:t>3.1 Starting a Shift</w:t>
+        <w:t>3.1 Real-Time Route Discovery</w:t>
+      </w:r>
+    </w:p>
+    <w:p>
+      <w:pPr>
+        <w:pStyle w:val="ListBullet"/>
+      </w:pPr>
+      <w:r>
+        <w:t>**Nearby Stops:** Uses Haversine geometry to find stops within a 0.5km radius.</w:t>
+      </w:r>
+    </w:p>
+    <w:p>
+      <w:pPr>
+        <w:pStyle w:val="ListBullet"/>
+      </w:pPr>
+      <w:r>
+        <w:t>**Route Search:** Query all 30+ static routes including 138, 163, and 171.</w:t>
+      </w:r>
+    </w:p>
+    <w:p/>
+    <w:p>
+      <w:pPr>
+        <w:pStyle w:val="Heading2"/>
+      </w:pPr>
+      <w:r>
+        <w:t>3.2 Trip Lifecycle</w:t>
       </w:r>
     </w:p>
     <w:p>
@@ -312,7 +244,7 @@
         <w:pStyle w:val="ListNumber"/>
       </w:pPr>
       <w:r>
-        <w:t>Log in to the `busgo_drive` app.</w:t>
+        <w:t>**Boarding:** Scan the bus QR or select manually.</w:t>
       </w:r>
     </w:p>
     <w:p>
@@ -320,7 +252,7 @@
         <w:pStyle w:val="ListNumber"/>
       </w:pPr>
       <w:r>
-        <w:t>Confirm your assigned bus and route.</w:t>
+        <w:t>**Live Tracking:** Subscribes to the `bus-locations` Supabase broadcast channel for sub-second GPS updates.</w:t>
       </w:r>
     </w:p>
     <w:p>
@@ -328,7 +260,7 @@
         <w:pStyle w:val="ListNumber"/>
       </w:pPr>
       <w:r>
-        <w:t>Enable "Live Tracking" to begin broadcasting your location.</w:t>
+        <w:t>**Alighting:** Automated fare calculation (LKR) based on boarding and alighting stops.</w:t>
       </w:r>
     </w:p>
     <w:p/>
@@ -341,32 +273,7 @@
           <w:b/>
           <w:i/>
         </w:rPr>
-        <w:t>**[IMAGE: Driver Shift Start Screen]**</w:t>
-      </w:r>
-    </w:p>
-    <w:p/>
-    <w:p>
-      <w:pPr>
-        <w:pStyle w:val="Heading2"/>
-      </w:pPr>
-      <w:r>
-        <w:t>3.2 Real-time Updates</w:t>
-      </w:r>
-    </w:p>
-    <w:p>
-      <w:pPr>
-        <w:pStyle w:val="ListBullet"/>
-      </w:pPr>
-      <w:r>
-        <w:t>**GPS Status:** Ensure your device's GPS is active at all times during your trip.</w:t>
-      </w:r>
-    </w:p>
-    <w:p>
-      <w:pPr>
-        <w:pStyle w:val="ListBullet"/>
-      </w:pPr>
-      <w:r>
-        <w:t>**Crowd Reporting:** Manually update the crowd level if the system requires a manual override.</w:t>
+        <w:t>**[IMAGE: Real-time Bus Tracking Map]**</w:t>
       </w:r>
     </w:p>
     <w:p/>
@@ -381,12 +288,12 @@
         <w:pStyle w:val="Heading1"/>
       </w:pPr>
       <w:r>
-        <w:t>4. Conductor Guide (BusGo Scanner)</w:t>
+        <w:t>4. Driver Operations (BusGo Drive)</w:t>
       </w:r>
     </w:p>
     <w:p>
       <w:r>
-        <w:t>The BusGo Scanner app ensures accurate trip completion.</w:t>
+        <w:t>The backbone of our real-time data.</w:t>
       </w:r>
     </w:p>
     <w:p/>
@@ -395,7 +302,7 @@
         <w:pStyle w:val="Heading2"/>
       </w:pPr>
       <w:r>
-        <w:t>4.1 Scanning Passengers</w:t>
+        <w:t>4.1 Shift Initialization</w:t>
       </w:r>
     </w:p>
     <w:p>
@@ -403,7 +310,7 @@
         <w:pStyle w:val="ListBullet"/>
       </w:pPr>
       <w:r>
-        <w:t>As passengers exit the bus, use the **Scanner** to read their QR codes.</w:t>
+        <w:t>Drivers must log in and bind to a specific `bus_id` and `route_id`.</w:t>
       </w:r>
     </w:p>
     <w:p>
@@ -411,20 +318,32 @@
         <w:pStyle w:val="ListBullet"/>
       </w:pPr>
       <w:r>
-        <w:t>The system will automatically calculate the fare and update the passenger's trip history.</w:t>
+        <w:t>**Location Broadcasting:** Constant PUT requests to `/buses/:id/location`.</w:t>
       </w:r>
     </w:p>
     <w:p/>
     <w:p>
       <w:pPr>
-        <w:ind w:left="360"/>
+        <w:pStyle w:val="Heading2"/>
       </w:pPr>
       <w:r>
-        <w:rPr>
-          <w:b/>
-          <w:i/>
-        </w:rPr>
-        <w:t>**[IMAGE: Conductor QR Scanner Interface]**</w:t>
+        <w:t>4.2 Crowd Reporting</w:t>
+      </w:r>
+    </w:p>
+    <w:p>
+      <w:pPr>
+        <w:pStyle w:val="ListBullet"/>
+      </w:pPr>
+      <w:r>
+        <w:t>Drivers or sensors update crowd levels: `low`, `medium`, `high`, or `full`.</w:t>
+      </w:r>
+    </w:p>
+    <w:p>
+      <w:pPr>
+        <w:pStyle w:val="ListBullet"/>
+      </w:pPr>
+      <w:r>
+        <w:t>**Neo Engine Sync:** Crowd levels influence passenger ETA and route recommendations.</w:t>
       </w:r>
     </w:p>
     <w:p/>
@@ -439,12 +358,12 @@
         <w:pStyle w:val="Heading1"/>
       </w:pPr>
       <w:r>
-        <w:t>5. Administrator Manual (BusGo Admin)</w:t>
+        <w:t>5. Conductor &amp; Scanning (BusGo Scanner)</w:t>
       </w:r>
     </w:p>
     <w:p>
       <w:r>
-        <w:t>The Admin Dashboard provides high-level oversight and resource management.</w:t>
+        <w:t>Ensuring revenue integrity through QR technology.</w:t>
       </w:r>
     </w:p>
     <w:p/>
@@ -453,7 +372,7 @@
         <w:pStyle w:val="Heading2"/>
       </w:pPr>
       <w:r>
-        <w:t>5.1 System Monitoring</w:t>
+        <w:t>5.1 QR Validation</w:t>
       </w:r>
     </w:p>
     <w:p>
@@ -461,7 +380,7 @@
         <w:pStyle w:val="ListBullet"/>
       </w:pPr>
       <w:r>
-        <w:t>**Live Overview:** View all active buses on a centralized map.</w:t>
+        <w:t>Scans the user's `qr_token`. The system auto-regenerates tokens if expired (30-second TTL).</w:t>
       </w:r>
     </w:p>
     <w:p>
@@ -469,70 +388,7 @@
         <w:pStyle w:val="ListBullet"/>
       </w:pPr>
       <w:r>
-        <w:t>**Analytics:** Access data on trip frequency, passenger satisfaction, and revenue.</w:t>
-      </w:r>
-    </w:p>
-    <w:p/>
-    <w:p>
-      <w:pPr>
-        <w:ind w:left="360"/>
-      </w:pPr>
-      <w:r>
-        <w:rPr>
-          <w:b/>
-          <w:i/>
-        </w:rPr>
-        <w:t>**[IMAGE: Admin Dashboard Overview]**</w:t>
-      </w:r>
-    </w:p>
-    <w:p/>
-    <w:p>
-      <w:pPr>
-        <w:pStyle w:val="Heading2"/>
-      </w:pPr>
-      <w:r>
-        <w:t>5.2 Resource Management</w:t>
-      </w:r>
-    </w:p>
-    <w:p>
-      <w:pPr>
-        <w:pStyle w:val="ListBullet"/>
-      </w:pPr>
-      <w:r>
-        <w:t>**Route Planning:** Create and modify bus routes and stop sequences.</w:t>
-      </w:r>
-    </w:p>
-    <w:p>
-      <w:pPr>
-        <w:pStyle w:val="ListBullet"/>
-      </w:pPr>
-      <w:r>
-        <w:t>**User Management:** Oversee driver assignments and passenger support tickets.</w:t>
-      </w:r>
-    </w:p>
-    <w:p/>
-    <w:p>
-      <w:pPr>
-        <w:pStyle w:val="Heading2"/>
-      </w:pPr>
-      <w:r>
-        <w:t>5.3 Neo Engine (AI)</w:t>
-      </w:r>
-    </w:p>
-    <w:p>
-      <w:pPr>
-        <w:pStyle w:val="ListBullet"/>
-      </w:pPr>
-      <w:r>
-        <w:t>**ETA Prediction:** Monitor the accuracy of AI-driven arrival times.</w:t>
-      </w:r>
-    </w:p>
-    <w:p>
-      <w:pPr>
-        <w:pStyle w:val="ListBullet"/>
-      </w:pPr>
-      <w:r>
-        <w:t>**Emergency Triage:** Review AI-prioritized incident reports for rapid response.</w:t>
+        <w:t>**Exit Scan:** Triggers the completion of the `trip` record and updates `fare_lkr`.</w:t>
       </w:r>
     </w:p>
     <w:p/>
@@ -547,12 +403,12 @@
         <w:pStyle w:val="Heading1"/>
       </w:pPr>
       <w:r>
-        <w:t>6. Emergency &amp; Safety Features</w:t>
+        <w:t>6. The Neo Engine: AI &amp; Intelligent Features</w:t>
       </w:r>
     </w:p>
     <w:p>
       <w:r>
-        <w:t>Your safety is our priority.</w:t>
+        <w:t>Our machine learning layer provides predictive power.</w:t>
       </w:r>
     </w:p>
     <w:p/>
@@ -561,7 +417,7 @@
         <w:pStyle w:val="ListBullet"/>
       </w:pPr>
       <w:r>
-        <w:t>**SOS Button:** Available in all apps. Pressing this triggers an immediate alert to system administrators and emergency services, including your precise GPS coordinates.</w:t>
+        <w:t>**ETA Estimation:** Uses traffic-aware logic (distance/speed * 60) with historical fallback.</w:t>
       </w:r>
     </w:p>
     <w:p>
@@ -569,20 +425,15 @@
         <w:pStyle w:val="ListBullet"/>
       </w:pPr>
       <w:r>
-        <w:t>**Incident Reporting:** Passengers can report safety concerns or driver behavior directly through the app.</w:t>
+        <w:t>**Sentiment Analysis:** Processes multi-language reviews (Sinhala, Tamil, English) to rate drivers.</w:t>
       </w:r>
     </w:p>
-    <w:p/>
     <w:p>
       <w:pPr>
-        <w:ind w:left="360"/>
+        <w:pStyle w:val="ListBullet"/>
       </w:pPr>
       <w:r>
-        <w:rPr>
-          <w:b/>
-          <w:i/>
-        </w:rPr>
-        <w:t>**[IMAGE: Emergency SOS Interface]**</w:t>
+        <w:t>**Predictive Triage:** Automatically filters high-priority emergency alerts.</w:t>
       </w:r>
     </w:p>
     <w:p/>
@@ -597,7 +448,21 @@
         <w:pStyle w:val="Heading1"/>
       </w:pPr>
       <w:r>
-        <w:t>7. Troubleshooting &amp; Support</w:t>
+        <w:t>7. 🚨 Emergency Alert &amp; Incident Response System</w:t>
+      </w:r>
+    </w:p>
+    <w:p>
+      <w:r>
+        <w:t>The most critical module in the BusGo ecosystem.</w:t>
+      </w:r>
+    </w:p>
+    <w:p/>
+    <w:p>
+      <w:pPr>
+        <w:pStyle w:val="Heading2"/>
+      </w:pPr>
+      <w:r>
+        <w:t>7.1 Triggering an Alert</w:t>
       </w:r>
     </w:p>
     <w:p>
@@ -605,7 +470,7 @@
         <w:pStyle w:val="ListBullet"/>
       </w:pPr>
       <w:r>
-        <w:t>**GPS Issues:** Ensure "High Accuracy" location mode is enabled on your device.</w:t>
+        <w:t>**SOS Button:** Available on every screen for passengers and drivers.</w:t>
       </w:r>
     </w:p>
     <w:p>
@@ -613,7 +478,16 @@
         <w:pStyle w:val="ListBullet"/>
       </w:pPr>
       <w:r>
-        <w:t>**Connection Errors:** Verify your mobile data or Wi-Fi connection.</w:t>
+        <w:t>**Payload:** Captures `user_id`, `bus_id`, `trip_id`, `alert_type`, and precise latitude/longitude.</w:t>
+      </w:r>
+    </w:p>
+    <w:p/>
+    <w:p>
+      <w:pPr>
+        <w:pStyle w:val="Heading2"/>
+      </w:pPr>
+      <w:r>
+        <w:t>7.2 Alert Types</w:t>
       </w:r>
     </w:p>
     <w:p>
@@ -621,7 +495,262 @@
         <w:pStyle w:val="ListBullet"/>
       </w:pPr>
       <w:r>
-        <w:t>**Account Support:** Contact us at `support@busgo.lk` for password resets or account inquiries.</w:t>
+        <w:t>`Medical`: Immediate ambulance dispatch.</w:t>
+      </w:r>
+    </w:p>
+    <w:p>
+      <w:pPr>
+        <w:pStyle w:val="ListBullet"/>
+      </w:pPr>
+      <w:r>
+        <w:t>`Security`: Police/Security notification for harassment or theft.</w:t>
+      </w:r>
+    </w:p>
+    <w:p>
+      <w:pPr>
+        <w:pStyle w:val="ListBullet"/>
+      </w:pPr>
+      <w:r>
+        <w:t>`Mechanical`: Bus breakdown reporting.</w:t>
+      </w:r>
+    </w:p>
+    <w:p>
+      <w:pPr>
+        <w:pStyle w:val="ListBullet"/>
+      </w:pPr>
+      <w:r>
+        <w:t>`Accident`: Multi-agency response.</w:t>
+      </w:r>
+    </w:p>
+    <w:p/>
+    <w:p>
+      <w:pPr>
+        <w:pStyle w:val="Heading2"/>
+      </w:pPr>
+      <w:r>
+        <w:t>7.3 Triage &amp; Resolution</w:t>
+      </w:r>
+    </w:p>
+    <w:p>
+      <w:pPr>
+        <w:pStyle w:val="ListBullet"/>
+      </w:pPr>
+      <w:r>
+        <w:t>Alerts are persisted in the `emergency_alerts` table.</w:t>
+      </w:r>
+    </w:p>
+    <w:p>
+      <w:pPr>
+        <w:pStyle w:val="ListBullet"/>
+      </w:pPr>
+      <w:r>
+        <w:t>Admins see alerts in real-time with status tracking (`Pending`, `Dispatched`, `Resolved`).</w:t>
+      </w:r>
+    </w:p>
+    <w:p/>
+    <w:p>
+      <w:pPr>
+        <w:ind w:left="360"/>
+      </w:pPr>
+      <w:r>
+        <w:rPr>
+          <w:b/>
+          <w:i/>
+        </w:rPr>
+        <w:t>**[IMAGE: Emergency SOS Dashboard with Live Triage]**</w:t>
+      </w:r>
+    </w:p>
+    <w:p/>
+    <w:p>
+      <w:r>
+        <w:br w:type="page"/>
+      </w:r>
+    </w:p>
+    <w:p/>
+    <w:p>
+      <w:pPr>
+        <w:pStyle w:val="Heading1"/>
+      </w:pPr>
+      <w:r>
+        <w:t>8. Administrative Governance (BusGo Admin)</w:t>
+      </w:r>
+    </w:p>
+    <w:p>
+      <w:r>
+        <w:t>Full system oversight via the React-based dashboard.</w:t>
+      </w:r>
+    </w:p>
+    <w:p/>
+    <w:p>
+      <w:pPr>
+        <w:pStyle w:val="ListBullet"/>
+      </w:pPr>
+      <w:r>
+        <w:t>**Route Management:** Manage the `bus_routes` and `route_stops` tables.</w:t>
+      </w:r>
+    </w:p>
+    <w:p>
+      <w:pPr>
+        <w:pStyle w:val="ListBullet"/>
+      </w:pPr>
+      <w:r>
+        <w:t>**Analytics:** Visualize `ratings`, `trips`, and `revenue` data.</w:t>
+      </w:r>
+    </w:p>
+    <w:p>
+      <w:pPr>
+        <w:pStyle w:val="ListBullet"/>
+      </w:pPr>
+      <w:r>
+        <w:t>**Notifications:** Send system-wide broadcasts using the `notifications` module.</w:t>
+      </w:r>
+    </w:p>
+    <w:p/>
+    <w:p>
+      <w:r>
+        <w:br w:type="page"/>
+      </w:r>
+    </w:p>
+    <w:p/>
+    <w:p>
+      <w:pPr>
+        <w:pStyle w:val="Heading1"/>
+      </w:pPr>
+      <w:r>
+        <w:t>9. Database &amp; Data Integrity</w:t>
+      </w:r>
+    </w:p>
+    <w:p>
+      <w:r>
+        <w:t>BusGo maintains 12 core PostgreSQL tables with strict RLS (Row Level Security) policies.</w:t>
+      </w:r>
+    </w:p>
+    <w:p/>
+    <w:p>
+      <w:pPr>
+        <w:pStyle w:val="ListBullet"/>
+      </w:pPr>
+      <w:r>
+        <w:t>**`recent_searches`:** Optimized with a trigger that keeps only the 5 most recent queries per user.</w:t>
+      </w:r>
+    </w:p>
+    <w:p>
+      <w:pPr>
+        <w:pStyle w:val="ListBullet"/>
+      </w:pPr>
+      <w:r>
+        <w:t>**`updated_at`:** Managed via automated triggers across all tables.</w:t>
+      </w:r>
+    </w:p>
+    <w:p>
+      <w:pPr>
+        <w:pStyle w:val="ListBullet"/>
+      </w:pPr>
+      <w:r>
+        <w:t>**Indexing:** 20+ custom indexes ensure sub-100ms query times for geo-filters.</w:t>
+      </w:r>
+    </w:p>
+    <w:p/>
+    <w:p>
+      <w:r>
+        <w:br w:type="page"/>
+      </w:r>
+    </w:p>
+    <w:p/>
+    <w:p>
+      <w:pPr>
+        <w:pStyle w:val="Heading1"/>
+      </w:pPr>
+      <w:r>
+        <w:t>10. 🛠️ Technical Troubleshooting</w:t>
+      </w:r>
+    </w:p>
+    <w:p>
+      <w:r>
+        <w:t>Mommy's guide to fixing common issues.</w:t>
+      </w:r>
+    </w:p>
+    <w:p/>
+    <w:p>
+      <w:pPr>
+        <w:pStyle w:val="Heading2"/>
+      </w:pPr>
+      <w:r>
+        <w:t>10.1 App &amp; Connection</w:t>
+      </w:r>
+    </w:p>
+    <w:p>
+      <w:pPr>
+        <w:pStyle w:val="ListBullet"/>
+      </w:pPr>
+      <w:r>
+        <w:t>**"Network Error":** Verify `connectivity_plus` status. Check if the backend port (5000) is accessible.</w:t>
+      </w:r>
+    </w:p>
+    <w:p>
+      <w:pPr>
+        <w:pStyle w:val="ListBullet"/>
+      </w:pPr>
+      <w:r>
+        <w:t>**"Session Expired":** Clear your `flutter_secure_storage` or re-login to trigger a refresh token rotation.</w:t>
+      </w:r>
+    </w:p>
+    <w:p>
+      <w:pPr>
+        <w:pStyle w:val="ListBullet"/>
+      </w:pPr>
+      <w:r>
+        <w:t>**Map Not Loading:** Ensure OSRM routing service is reachable and GPS permissions are granted.</w:t>
+      </w:r>
+    </w:p>
+    <w:p/>
+    <w:p>
+      <w:pPr>
+        <w:pStyle w:val="Heading2"/>
+      </w:pPr>
+      <w:r>
+        <w:t>10.2 GPS &amp; Tracking</w:t>
+      </w:r>
+    </w:p>
+    <w:p>
+      <w:pPr>
+        <w:pStyle w:val="ListBullet"/>
+      </w:pPr>
+      <w:r>
+        <w:t>**Bus Not Moving:** Check if the Driver App has "High Accuracy" location enabled. Verify Supabase Realtime subscription status.</w:t>
+      </w:r>
+    </w:p>
+    <w:p>
+      <w:pPr>
+        <w:pStyle w:val="ListBullet"/>
+      </w:pPr>
+      <w:r>
+        <w:t>**Inaccurate ETA:** Ensure `current_speed_kmh` is being updated by the driver app.</w:t>
+      </w:r>
+    </w:p>
+    <w:p/>
+    <w:p>
+      <w:pPr>
+        <w:pStyle w:val="Heading2"/>
+      </w:pPr>
+      <w:r>
+        <w:t>10.3 QR &amp; Payments</w:t>
+      </w:r>
+    </w:p>
+    <w:p>
+      <w:pPr>
+        <w:pStyle w:val="ListBullet"/>
+      </w:pPr>
+      <w:r>
+        <w:t>**QR Not Scanning:** Check screen brightness and ensure the `qr_token` hasn't expired (tokens refresh every 30s).</w:t>
+      </w:r>
+    </w:p>
+    <w:p>
+      <w:pPr>
+        <w:pStyle w:val="ListBullet"/>
+      </w:pPr>
+      <w:r>
+        <w:t>**Fare Discrepancy:** Verify the `boarding_stop_id` and `alighting_stop_id` were correctly recorded in the `trips` table.</w:t>
       </w:r>
     </w:p>
     <w:p/>
@@ -632,7 +761,7 @@
     </w:p>
     <w:p>
       <w:r>
-        <w:t>*Generated by BusGo Documentation Team - 2026*</w:t>
+        <w:t>*Generated by BusGo Documentation Engine - Production Version 2026*</w:t>
       </w:r>
     </w:p>
     <w:sectPr>

</xml_diff>

<commit_message>
docs: finalize user manual with cover page
</commit_message>
<xml_diff>
--- a/docs/User_Manual.docx
+++ b/docs/User_Manual.docx
@@ -2,6 +2,50 @@
 <file path=word/document.xml><?xml version="1.0" encoding="utf-8"?>
 <w:document xmlns:wpc="http://schemas.microsoft.com/office/word/2010/wordprocessingCanvas" xmlns:mo="http://schemas.microsoft.com/office/mac/office/2008/main" xmlns:mc="http://schemas.openxmlformats.org/markup-compatibility/2006" xmlns:mv="urn:schemas-microsoft-com:mac:vml" xmlns:o="urn:schemas-microsoft-com:office:office" xmlns:r="http://schemas.openxmlformats.org/officeDocument/2006/relationships" xmlns:m="http://schemas.openxmlformats.org/officeDocument/2006/math" xmlns:v="urn:schemas-microsoft-com:vml" xmlns:wp14="http://schemas.microsoft.com/office/word/2010/wordprocessingDrawing" xmlns:wp="http://schemas.openxmlformats.org/drawingml/2006/wordprocessingDrawing" xmlns:w10="urn:schemas-microsoft-com:office:word" xmlns:w="http://schemas.openxmlformats.org/wordprocessingml/2006/main" xmlns:w14="http://schemas.microsoft.com/office/word/2010/wordml" xmlns:wpg="http://schemas.microsoft.com/office/word/2010/wordprocessingGroup" xmlns:wpi="http://schemas.microsoft.com/office/word/2010/wordprocessingInk" xmlns:wne="http://schemas.microsoft.com/office/word/2006/wordml" xmlns:wps="http://schemas.microsoft.com/office/word/2010/wordprocessingShape" mc:Ignorable="w14 wp14">
   <w:body>
+    <w:p>
+      <w:pPr>
+        <w:jc w:val="center"/>
+      </w:pPr>
+      <w:r>
+        <w:drawing>
+          <wp:inline xmlns:a="http://schemas.openxmlformats.org/drawingml/2006/main" xmlns:pic="http://schemas.openxmlformats.org/drawingml/2006/picture">
+            <wp:extent cx="5486400" cy="7760648"/>
+            <wp:docPr id="1" name="Picture 1"/>
+            <wp:cNvGraphicFramePr>
+              <a:graphicFrameLocks noChangeAspect="1"/>
+            </wp:cNvGraphicFramePr>
+            <a:graphic>
+              <a:graphicData uri="http://schemas.openxmlformats.org/drawingml/2006/picture">
+                <pic:pic>
+                  <pic:nvPicPr>
+                    <pic:cNvPr id="0" name="kandy_midnight_blue_20260415_200329.png"/>
+                    <pic:cNvPicPr/>
+                  </pic:nvPicPr>
+                  <pic:blipFill>
+                    <a:blip r:embed="rId9"/>
+                    <a:stretch>
+                      <a:fillRect/>
+                    </a:stretch>
+                  </pic:blipFill>
+                  <pic:spPr>
+                    <a:xfrm>
+                      <a:off x="0" y="0"/>
+                      <a:ext cx="5486400" cy="7760648"/>
+                    </a:xfrm>
+                    <a:prstGeom prst="rect"/>
+                  </pic:spPr>
+                </pic:pic>
+              </a:graphicData>
+            </a:graphic>
+          </wp:inline>
+        </w:drawing>
+      </w:r>
+    </w:p>
+    <w:p>
+      <w:r>
+        <w:br w:type="page"/>
+      </w:r>
+    </w:p>
     <w:p>
       <w:pPr>
         <w:pStyle w:val="Title"/>

</xml_diff>

<commit_message>
docs: finalize user manual with full-page cover and remove troubleshooting
</commit_message>
<xml_diff>
--- a/docs/User_Manual.docx
+++ b/docs/User_Manual.docx
@@ -9,7 +9,7 @@
       <w:r>
         <w:drawing>
           <wp:inline xmlns:a="http://schemas.openxmlformats.org/drawingml/2006/main" xmlns:pic="http://schemas.openxmlformats.org/drawingml/2006/picture">
-            <wp:extent cx="5486400" cy="7760648"/>
+            <wp:extent cx="7772400" cy="10058400"/>
             <wp:docPr id="1" name="Picture 1"/>
             <wp:cNvGraphicFramePr>
               <a:graphicFrameLocks noChangeAspect="1"/>
@@ -30,7 +30,7 @@
                   <pic:spPr>
                     <a:xfrm>
                       <a:off x="0" y="0"/>
-                      <a:ext cx="5486400" cy="7760648"/>
+                      <a:ext cx="7772400" cy="10058400"/>
                     </a:xfrm>
                     <a:prstGeom prst="rect"/>
                   </pic:spPr>
@@ -45,6 +45,16 @@
       <w:r>
         <w:br w:type="page"/>
       </w:r>
+    </w:p>
+    <w:p>
+      <w:pPr>
+        <w:sectPr>
+          <w:pgSz w:w="12240" w:h="15840"/>
+          <w:pgMar w:top="0" w:right="0" w:bottom="0" w:left="0" w:header="720" w:footer="720" w:gutter="0"/>
+          <w:cols w:space="720"/>
+          <w:docGrid w:linePitch="360"/>
+        </w:sectPr>
+      </w:pPr>
     </w:p>
     <w:p>
       <w:pPr>
@@ -127,11 +137,6 @@
     <w:p>
       <w:r>
         <w:t>9. [Database &amp; Data Integrity](#9-database--data-integrity)</w:t>
-      </w:r>
-    </w:p>
-    <w:p>
-      <w:r>
-        <w:t>10. [🛠️ Technical Troubleshooting](#10-technical-troubleshooting)</w:t>
       </w:r>
     </w:p>
     <w:p/>
@@ -700,109 +705,6 @@
         <w:br w:type="page"/>
       </w:r>
     </w:p>
-    <w:p/>
-    <w:p>
-      <w:pPr>
-        <w:pStyle w:val="Heading1"/>
-      </w:pPr>
-      <w:r>
-        <w:t>10. 🛠️ Technical Troubleshooting</w:t>
-      </w:r>
-    </w:p>
-    <w:p>
-      <w:r>
-        <w:t>Mommy's guide to fixing common issues.</w:t>
-      </w:r>
-    </w:p>
-    <w:p/>
-    <w:p>
-      <w:pPr>
-        <w:pStyle w:val="Heading2"/>
-      </w:pPr>
-      <w:r>
-        <w:t>10.1 App &amp; Connection</w:t>
-      </w:r>
-    </w:p>
-    <w:p>
-      <w:pPr>
-        <w:pStyle w:val="ListBullet"/>
-      </w:pPr>
-      <w:r>
-        <w:t>**"Network Error":** Verify `connectivity_plus` status. Check if the backend port (5000) is accessible.</w:t>
-      </w:r>
-    </w:p>
-    <w:p>
-      <w:pPr>
-        <w:pStyle w:val="ListBullet"/>
-      </w:pPr>
-      <w:r>
-        <w:t>**"Session Expired":** Clear your `flutter_secure_storage` or re-login to trigger a refresh token rotation.</w:t>
-      </w:r>
-    </w:p>
-    <w:p>
-      <w:pPr>
-        <w:pStyle w:val="ListBullet"/>
-      </w:pPr>
-      <w:r>
-        <w:t>**Map Not Loading:** Ensure OSRM routing service is reachable and GPS permissions are granted.</w:t>
-      </w:r>
-    </w:p>
-    <w:p/>
-    <w:p>
-      <w:pPr>
-        <w:pStyle w:val="Heading2"/>
-      </w:pPr>
-      <w:r>
-        <w:t>10.2 GPS &amp; Tracking</w:t>
-      </w:r>
-    </w:p>
-    <w:p>
-      <w:pPr>
-        <w:pStyle w:val="ListBullet"/>
-      </w:pPr>
-      <w:r>
-        <w:t>**Bus Not Moving:** Check if the Driver App has "High Accuracy" location enabled. Verify Supabase Realtime subscription status.</w:t>
-      </w:r>
-    </w:p>
-    <w:p>
-      <w:pPr>
-        <w:pStyle w:val="ListBullet"/>
-      </w:pPr>
-      <w:r>
-        <w:t>**Inaccurate ETA:** Ensure `current_speed_kmh` is being updated by the driver app.</w:t>
-      </w:r>
-    </w:p>
-    <w:p/>
-    <w:p>
-      <w:pPr>
-        <w:pStyle w:val="Heading2"/>
-      </w:pPr>
-      <w:r>
-        <w:t>10.3 QR &amp; Payments</w:t>
-      </w:r>
-    </w:p>
-    <w:p>
-      <w:pPr>
-        <w:pStyle w:val="ListBullet"/>
-      </w:pPr>
-      <w:r>
-        <w:t>**QR Not Scanning:** Check screen brightness and ensure the `qr_token` hasn't expired (tokens refresh every 30s).</w:t>
-      </w:r>
-    </w:p>
-    <w:p>
-      <w:pPr>
-        <w:pStyle w:val="ListBullet"/>
-      </w:pPr>
-      <w:r>
-        <w:t>**Fare Discrepancy:** Verify the `boarding_stop_id` and `alighting_stop_id` were correctly recorded in the `trips` table.</w:t>
-      </w:r>
-    </w:p>
-    <w:p/>
-    <w:p>
-      <w:r>
-        <w:br w:type="page"/>
-      </w:r>
-    </w:p>
     <w:p>
       <w:r>
         <w:t>*Generated by BusGo Documentation Engine - Production Version 2026*</w:t>
@@ -810,7 +712,7 @@
     </w:p>
     <w:sectPr>
       <w:pgSz w:w="12240" w:h="15840"/>
-      <w:pgMar w:top="1440" w:right="1800" w:bottom="1440" w:left="1800" w:header="720" w:footer="720" w:gutter="0"/>
+      <w:pgMar w:top="1440" w:right="1440" w:bottom="1440" w:left="1440" w:header="720" w:footer="720" w:gutter="0"/>
       <w:cols w:space="720"/>
       <w:docGrid w:linePitch="360"/>
     </w:sectPr>

</xml_diff>

<commit_message>
docs: expand user manual with deep technical content and phone frames
</commit_message>
<xml_diff>
--- a/docs/User_Manual.docx
+++ b/docs/User_Manual.docx
@@ -82,7 +82,7 @@
         <w:pStyle w:val="Heading1"/>
       </w:pPr>
       <w:r>
-        <w:t>📋 Extended Table of Contents</w:t>
+        <w:t>📋 Technical Table of Contents</w:t>
       </w:r>
     </w:p>
     <w:p>
@@ -90,7 +90,7 @@
         <w:pStyle w:val="ListNumber"/>
       </w:pPr>
       <w:r>
-        <w:t>[System Overview &amp; Architecture](#1-system-overview--architecture)</w:t>
+        <w:t>[Core Architecture &amp; Security Layers](#1-core-architecture--security-layers)</w:t>
       </w:r>
     </w:p>
     <w:p>
@@ -98,7 +98,7 @@
         <w:pStyle w:val="ListNumber"/>
       </w:pPr>
       <w:r>
-        <w:t>[Identity &amp; Access Management (Auth)](#2-identity--access-management-auth)</w:t>
+        <w:t>[Identity &amp; Access Management (IAM)](#2-identity--access-management-iam)</w:t>
       </w:r>
     </w:p>
     <w:p>
@@ -111,7 +111,7 @@
     </w:p>
     <w:p>
       <w:r>
-        <w:t>4. [Driver Operations (BusGo Drive)](#4-driver-operations-busgo-drive)</w:t>
+        <w:t>4. [Driver Operations &amp; GPS Streaming (BusGo Drive)](#4-driver-operations--gps-streaming-busgo-drive)</w:t>
       </w:r>
     </w:p>
     <w:p>
@@ -121,7 +121,7 @@
     </w:p>
     <w:p>
       <w:r>
-        <w:t>6. [The Neo Engine: AI &amp; Intelligent Features](#6-the-neo-engine-ai--intelligent-features)</w:t>
+        <w:t>6. [The Neo Engine: AI &amp; Predictive Intelligence](#6-the-neo-engine-ai--predictive-intelligence)</w:t>
       </w:r>
     </w:p>
     <w:p>
@@ -131,12 +131,12 @@
     </w:p>
     <w:p>
       <w:r>
-        <w:t>8. [Administrative Governance (BusGo Admin)](#8-administrative-governance-busgo-admin)</w:t>
+        <w:t>8. [Administrative Governance &amp; Analytics (BusGo Admin)](#8-administrative-governance--analytics-busgo-admin)</w:t>
       </w:r>
     </w:p>
     <w:p>
       <w:r>
-        <w:t>9. [Database &amp; Data Integrity](#9-database--data-integrity)</w:t>
+        <w:t>9. [Database Schema &amp; Data Integrity](#9-database-schema--data-integrity)</w:t>
       </w:r>
     </w:p>
     <w:p/>
@@ -151,12 +151,44 @@
         <w:pStyle w:val="Heading1"/>
       </w:pPr>
       <w:r>
-        <w:t>1. System Overview &amp; Architecture</w:t>
+        <w:t>1. Core Architecture &amp; Security Layers</w:t>
       </w:r>
     </w:p>
     <w:p>
       <w:r>
-        <w:t>BusGo is built on a high-performance Node.js/Express backend, utilizing Supabase (PostgreSQL) for real-time data persistence and broadcasting. The system architecture is divided into 11 domain modules, ensuring modularity and elite efficiency.</w:t>
+        <w:t>BusGo is built on a high-performance Node.js/Express backend. To maintain "Production-Ready" status, we employ multiple security layers:</w:t>
+      </w:r>
+    </w:p>
+    <w:p>
+      <w:pPr>
+        <w:pStyle w:val="ListBullet"/>
+      </w:pPr>
+      <w:r>
+        <w:t>**Helmet.js:** Configures 15 HTTP security headers.</w:t>
+      </w:r>
+    </w:p>
+    <w:p>
+      <w:pPr>
+        <w:pStyle w:val="ListBullet"/>
+      </w:pPr>
+      <w:r>
+        <w:t>**CORS:** Strict whitelist-based origin filtering.</w:t>
+      </w:r>
+    </w:p>
+    <w:p>
+      <w:pPr>
+        <w:pStyle w:val="ListBullet"/>
+      </w:pPr>
+      <w:r>
+        <w:t>**Rate Limiting:** 10 req/15 min on Auth; 100 req/min general API.</w:t>
+      </w:r>
+    </w:p>
+    <w:p>
+      <w:pPr>
+        <w:pStyle w:val="ListBullet"/>
+      </w:pPr>
+      <w:r>
+        <w:t>**Zod Validation:** Every request body is parsed and validated against strict schemas.</w:t>
       </w:r>
     </w:p>
     <w:p/>
@@ -171,12 +203,12 @@
         <w:pStyle w:val="Heading1"/>
       </w:pPr>
       <w:r>
-        <w:t>2. Identity &amp; Access Management (Auth)</w:t>
+        <w:t>2. Identity &amp; Access Management (IAM)</w:t>
       </w:r>
     </w:p>
     <w:p>
       <w:r>
-        <w:t>Our security layer utilizes JWT with dual-token rotation (15-minute access, 7-day refresh).</w:t>
+        <w:t>Our security layer utilizes JWT with dual-token rotation.</w:t>
       </w:r>
     </w:p>
     <w:p/>
@@ -201,7 +233,57 @@
         <w:pStyle w:val="ListBullet"/>
       </w:pPr>
       <w:r>
-        <w:t>**Roles:** Membership types (Standard, Premium, etc.) are assigned during registration.</w:t>
+        <w:t>**Membership:** Types include `standard`, `premium`, and `corporate`.</w:t>
+      </w:r>
+    </w:p>
+    <w:p/>
+    <w:tbl>
+      <w:tblPr>
+        <w:tblW w:type="auto" w:w="0"/>
+        <w:jc w:val="center"/>
+        <w:tblLook w:firstColumn="1" w:firstRow="1" w:lastColumn="0" w:lastRow="0" w:noHBand="0" w:noVBand="1" w:val="04A0"/>
+      </w:tblPr>
+      <w:tblGrid>
+        <w:gridCol w:w="9360"/>
+      </w:tblGrid>
+      <w:tr>
+        <w:tc>
+          <w:tcPr>
+            <w:tcW w:type="dxa" w:w="5040"/>
+            <w:top w:sz="24" w:val="single" w:color="000000" w:space="0"/>
+            <w:start w:sz="24" w:val="single" w:color="000000" w:space="0"/>
+            <w:bottom w:sz="24" w:val="single" w:color="000000" w:space="0"/>
+            <w:end w:sz="24" w:val="single" w:color="000000" w:space="0"/>
+          </w:tcPr>
+          <w:p>
+            <w:pPr>
+              <w:jc w:val="center"/>
+            </w:pPr>
+            <w:r>
+              <w:rPr>
+                <w:b/>
+                <w:i/>
+              </w:rPr>
+              <w:br/>
+              <w:br/>
+              <w:br/>
+              <w:br/>
+              <w:t>[ ADD PHONE SCREENSHOT HERE ]</w:t>
+              <w:br/>
+              <w:br/>
+              <w:br/>
+              <w:br/>
+            </w:r>
+          </w:p>
+        </w:tc>
+      </w:tr>
+    </w:tbl>
+    <w:p>
+      <w:pPr>
+        <w:jc w:val="center"/>
+      </w:pPr>
+      <w:r>
+        <w:t>Figure: Registration &amp; MFA Interface</w:t>
       </w:r>
     </w:p>
     <w:p/>
@@ -223,19 +305,6 @@
     </w:p>
     <w:p/>
     <w:p>
-      <w:pPr>
-        <w:ind w:left="360"/>
-      </w:pPr>
-      <w:r>
-        <w:rPr>
-          <w:b/>
-          <w:i/>
-        </w:rPr>
-        <w:t>**[IMAGE: Registration &amp; MFA Interface]**</w:t>
-      </w:r>
-    </w:p>
-    <w:p/>
-    <w:p>
       <w:r>
         <w:br w:type="page"/>
       </w:r>
@@ -251,7 +320,7 @@
     </w:p>
     <w:p>
       <w:r>
-        <w:t>Designed for the modern commuter in Colombo.</w:t>
+        <w:t>Designed with Flutter and Provider for elite state management.</w:t>
       </w:r>
     </w:p>
     <w:p/>
@@ -268,7 +337,7 @@
         <w:pStyle w:val="ListBullet"/>
       </w:pPr>
       <w:r>
-        <w:t>**Nearby Stops:** Uses Haversine geometry to find stops within a 0.5km radius.</w:t>
+        <w:t>**Nearby Stops:** Uses Haversine geometry (radius = 0.5km) to identify the closest stops.</w:t>
       </w:r>
     </w:p>
     <w:p>
@@ -276,7 +345,57 @@
         <w:pStyle w:val="ListBullet"/>
       </w:pPr>
       <w:r>
-        <w:t>**Route Search:** Query all 30+ static routes including 138, 163, and 171.</w:t>
+        <w:t>**Live Tracking:** Subscribes to the `bus-locations` Supabase broadcast channel for sub-second GPS updates.</w:t>
+      </w:r>
+    </w:p>
+    <w:p/>
+    <w:tbl>
+      <w:tblPr>
+        <w:tblW w:type="auto" w:w="0"/>
+        <w:jc w:val="center"/>
+        <w:tblLook w:firstColumn="1" w:firstRow="1" w:lastColumn="0" w:lastRow="0" w:noHBand="0" w:noVBand="1" w:val="04A0"/>
+      </w:tblPr>
+      <w:tblGrid>
+        <w:gridCol w:w="9360"/>
+      </w:tblGrid>
+      <w:tr>
+        <w:tc>
+          <w:tcPr>
+            <w:tcW w:type="dxa" w:w="5040"/>
+            <w:top w:sz="24" w:val="single" w:color="000000" w:space="0"/>
+            <w:start w:sz="24" w:val="single" w:color="000000" w:space="0"/>
+            <w:bottom w:sz="24" w:val="single" w:color="000000" w:space="0"/>
+            <w:end w:sz="24" w:val="single" w:color="000000" w:space="0"/>
+          </w:tcPr>
+          <w:p>
+            <w:pPr>
+              <w:jc w:val="center"/>
+            </w:pPr>
+            <w:r>
+              <w:rPr>
+                <w:b/>
+                <w:i/>
+              </w:rPr>
+              <w:br/>
+              <w:br/>
+              <w:br/>
+              <w:br/>
+              <w:t>[ ADD PHONE SCREENSHOT HERE ]</w:t>
+              <w:br/>
+              <w:br/>
+              <w:br/>
+              <w:br/>
+            </w:r>
+          </w:p>
+        </w:tc>
+      </w:tr>
+    </w:tbl>
+    <w:p>
+      <w:pPr>
+        <w:jc w:val="center"/>
+      </w:pPr>
+      <w:r>
+        <w:t>Figure: Real-time Bus Tracking Map</w:t>
       </w:r>
     </w:p>
     <w:p/>
@@ -290,7 +409,7 @@
     </w:p>
     <w:p>
       <w:pPr>
-        <w:pStyle w:val="ListNumber"/>
+        <w:pStyle w:val="ListBullet"/>
       </w:pPr>
       <w:r>
         <w:t>**Boarding:** Scan the bus QR or select manually.</w:t>
@@ -298,31 +417,10 @@
     </w:p>
     <w:p>
       <w:pPr>
-        <w:pStyle w:val="ListNumber"/>
+        <w:pStyle w:val="ListBullet"/>
       </w:pPr>
       <w:r>
-        <w:t>**Live Tracking:** Subscribes to the `bus-locations` Supabase broadcast channel for sub-second GPS updates.</w:t>
-      </w:r>
-    </w:p>
-    <w:p>
-      <w:pPr>
-        <w:pStyle w:val="ListNumber"/>
-      </w:pPr>
-      <w:r>
-        <w:t>**Alighting:** Automated fare calculation (LKR) based on boarding and alighting stops.</w:t>
-      </w:r>
-    </w:p>
-    <w:p/>
-    <w:p>
-      <w:pPr>
-        <w:ind w:left="360"/>
-      </w:pPr>
-      <w:r>
-        <w:rPr>
-          <w:b/>
-          <w:i/>
-        </w:rPr>
-        <w:t>**[IMAGE: Real-time Bus Tracking Map]**</w:t>
+        <w:t>**Fare Engine:** Automated LKR calculation based on boarding/alighting `stop_id` and the `fare_lkr` constant.</w:t>
       </w:r>
     </w:p>
     <w:p/>
@@ -337,12 +435,12 @@
         <w:pStyle w:val="Heading1"/>
       </w:pPr>
       <w:r>
-        <w:t>4. Driver Operations (BusGo Drive)</w:t>
+        <w:t>4. Driver Operations &amp; GPS Streaming (BusGo Drive)</w:t>
       </w:r>
     </w:p>
     <w:p>
       <w:r>
-        <w:t>The backbone of our real-time data.</w:t>
+        <w:t>The backbone of our real-time data flow.</w:t>
       </w:r>
     </w:p>
     <w:p/>
@@ -359,7 +457,7 @@
         <w:pStyle w:val="ListBullet"/>
       </w:pPr>
       <w:r>
-        <w:t>Drivers must log in and bind to a specific `bus_id` and `route_id`.</w:t>
+        <w:t>Drivers must log in and bind to a specific `bus_id`.</w:t>
       </w:r>
     </w:p>
     <w:p>
@@ -367,7 +465,57 @@
         <w:pStyle w:val="ListBullet"/>
       </w:pPr>
       <w:r>
-        <w:t>**Location Broadcasting:** Constant PUT requests to `/buses/:id/location`.</w:t>
+        <w:t>**Location Broadcasting:** Constant PUT requests to `/buses/:id/location` stream GPS and heading data.</w:t>
+      </w:r>
+    </w:p>
+    <w:p/>
+    <w:tbl>
+      <w:tblPr>
+        <w:tblW w:type="auto" w:w="0"/>
+        <w:jc w:val="center"/>
+        <w:tblLook w:firstColumn="1" w:firstRow="1" w:lastColumn="0" w:lastRow="0" w:noHBand="0" w:noVBand="1" w:val="04A0"/>
+      </w:tblPr>
+      <w:tblGrid>
+        <w:gridCol w:w="9360"/>
+      </w:tblGrid>
+      <w:tr>
+        <w:tc>
+          <w:tcPr>
+            <w:tcW w:type="dxa" w:w="5040"/>
+            <w:top w:sz="24" w:val="single" w:color="000000" w:space="0"/>
+            <w:start w:sz="24" w:val="single" w:color="000000" w:space="0"/>
+            <w:bottom w:sz="24" w:val="single" w:color="000000" w:space="0"/>
+            <w:end w:sz="24" w:val="single" w:color="000000" w:space="0"/>
+          </w:tcPr>
+          <w:p>
+            <w:pPr>
+              <w:jc w:val="center"/>
+            </w:pPr>
+            <w:r>
+              <w:rPr>
+                <w:b/>
+                <w:i/>
+              </w:rPr>
+              <w:br/>
+              <w:br/>
+              <w:br/>
+              <w:br/>
+              <w:t>[ ADD PHONE SCREENSHOT HERE ]</w:t>
+              <w:br/>
+              <w:br/>
+              <w:br/>
+              <w:br/>
+            </w:r>
+          </w:p>
+        </w:tc>
+      </w:tr>
+    </w:tbl>
+    <w:p>
+      <w:pPr>
+        <w:jc w:val="center"/>
+      </w:pPr>
+      <w:r>
+        <w:t>Figure: Driver Dashboard &amp; GPS Status</w:t>
       </w:r>
     </w:p>
     <w:p/>
@@ -384,7 +532,7 @@
         <w:pStyle w:val="ListBullet"/>
       </w:pPr>
       <w:r>
-        <w:t>Drivers or sensors update crowd levels: `low`, `medium`, `high`, or `full`.</w:t>
+        <w:t>Drivers update crowd levels: `low`, `medium`, `high`, or `full`.</w:t>
       </w:r>
     </w:p>
     <w:p>
@@ -392,7 +540,7 @@
         <w:pStyle w:val="ListBullet"/>
       </w:pPr>
       <w:r>
-        <w:t>**Neo Engine Sync:** Crowd levels influence passenger ETA and route recommendations.</w:t>
+        <w:t>**Sync:** These levels immediately reflect on all Passenger Apps via Realtime.</w:t>
       </w:r>
     </w:p>
     <w:p/>
@@ -429,7 +577,7 @@
         <w:pStyle w:val="ListBullet"/>
       </w:pPr>
       <w:r>
-        <w:t>Scans the user's `qr_token`. The system auto-regenerates tokens if expired (30-second TTL).</w:t>
+        <w:t>Scans the user's `qr_token`. The backend auto-regenerates tokens if the 30-second TTL expires.</w:t>
       </w:r>
     </w:p>
     <w:p>
@@ -437,7 +585,57 @@
         <w:pStyle w:val="ListBullet"/>
       </w:pPr>
       <w:r>
-        <w:t>**Exit Scan:** Triggers the completion of the `trip` record and updates `fare_lkr`.</w:t>
+        <w:t>**Exit Scan:** Triggers the completion of the `trip` record and calculates final fares.</w:t>
+      </w:r>
+    </w:p>
+    <w:p/>
+    <w:tbl>
+      <w:tblPr>
+        <w:tblW w:type="auto" w:w="0"/>
+        <w:jc w:val="center"/>
+        <w:tblLook w:firstColumn="1" w:firstRow="1" w:lastColumn="0" w:lastRow="0" w:noHBand="0" w:noVBand="1" w:val="04A0"/>
+      </w:tblPr>
+      <w:tblGrid>
+        <w:gridCol w:w="9360"/>
+      </w:tblGrid>
+      <w:tr>
+        <w:tc>
+          <w:tcPr>
+            <w:tcW w:type="dxa" w:w="5040"/>
+            <w:top w:sz="24" w:val="single" w:color="000000" w:space="0"/>
+            <w:start w:sz="24" w:val="single" w:color="000000" w:space="0"/>
+            <w:bottom w:sz="24" w:val="single" w:color="000000" w:space="0"/>
+            <w:end w:sz="24" w:val="single" w:color="000000" w:space="0"/>
+          </w:tcPr>
+          <w:p>
+            <w:pPr>
+              <w:jc w:val="center"/>
+            </w:pPr>
+            <w:r>
+              <w:rPr>
+                <w:b/>
+                <w:i/>
+              </w:rPr>
+              <w:br/>
+              <w:br/>
+              <w:br/>
+              <w:br/>
+              <w:t>[ ADD PHONE SCREENSHOT HERE ]</w:t>
+              <w:br/>
+              <w:br/>
+              <w:br/>
+              <w:br/>
+            </w:r>
+          </w:p>
+        </w:tc>
+      </w:tr>
+    </w:tbl>
+    <w:p>
+      <w:pPr>
+        <w:jc w:val="center"/>
+      </w:pPr>
+      <w:r>
+        <w:t>Figure: Conductor QR Scanner Interface</w:t>
       </w:r>
     </w:p>
     <w:p/>
@@ -452,12 +650,12 @@
         <w:pStyle w:val="Heading1"/>
       </w:pPr>
       <w:r>
-        <w:t>6. The Neo Engine: AI &amp; Intelligent Features</w:t>
+        <w:t>6. The Neo Engine: AI &amp; Predictive Intelligence</w:t>
       </w:r>
     </w:p>
     <w:p>
       <w:r>
-        <w:t>Our machine learning layer provides predictive power.</w:t>
+        <w:t>Our intelligence layer, built with Scikit-learn, XGBoost, and LightGBM.</w:t>
       </w:r>
     </w:p>
     <w:p/>
@@ -466,7 +664,7 @@
         <w:pStyle w:val="ListBullet"/>
       </w:pPr>
       <w:r>
-        <w:t>**ETA Estimation:** Uses traffic-aware logic (distance/speed * 60) with historical fallback.</w:t>
+        <w:t>**ETA Estimation:** Calculates arrival times using `distance_km / speed_kmh * 60` with a historical 5-minute fallback.</w:t>
       </w:r>
     </w:p>
     <w:p>
@@ -474,7 +672,7 @@
         <w:pStyle w:val="ListBullet"/>
       </w:pPr>
       <w:r>
-        <w:t>**Sentiment Analysis:** Processes multi-language reviews (Sinhala, Tamil, English) to rate drivers.</w:t>
+        <w:t>**Sentiment Analysis:** Analyzes passenger tags and comments to generate an aggregate Driver Rating.</w:t>
       </w:r>
     </w:p>
     <w:p>
@@ -482,7 +680,7 @@
         <w:pStyle w:val="ListBullet"/>
       </w:pPr>
       <w:r>
-        <w:t>**Predictive Triage:** Automatically filters high-priority emergency alerts.</w:t>
+        <w:t>**Predictive Triage:** Filters emergency alerts based on historical patterns and incident severity.</w:t>
       </w:r>
     </w:p>
     <w:p/>
@@ -502,7 +700,7 @@
     </w:p>
     <w:p>
       <w:r>
-        <w:t>The most critical module in the BusGo ecosystem.</w:t>
+        <w:t>The most critical module for passenger safety.</w:t>
       </w:r>
     </w:p>
     <w:p/>
@@ -519,7 +717,7 @@
         <w:pStyle w:val="ListBullet"/>
       </w:pPr>
       <w:r>
-        <w:t>**SOS Button:** Available on every screen for passengers and drivers.</w:t>
+        <w:t>**SOS Button:** Captures `user_id`, `bus_id`, and precise coordinates.</w:t>
       </w:r>
     </w:p>
     <w:p>
@@ -527,7 +725,57 @@
         <w:pStyle w:val="ListBullet"/>
       </w:pPr>
       <w:r>
-        <w:t>**Payload:** Captures `user_id`, `bus_id`, `trip_id`, `alert_type`, and precise latitude/longitude.</w:t>
+        <w:t>**Payload:** Dispatched to the `emergency_alerts` table with real-time Admin notification.</w:t>
+      </w:r>
+    </w:p>
+    <w:p/>
+    <w:tbl>
+      <w:tblPr>
+        <w:tblW w:type="auto" w:w="0"/>
+        <w:jc w:val="center"/>
+        <w:tblLook w:firstColumn="1" w:firstRow="1" w:lastColumn="0" w:lastRow="0" w:noHBand="0" w:noVBand="1" w:val="04A0"/>
+      </w:tblPr>
+      <w:tblGrid>
+        <w:gridCol w:w="9360"/>
+      </w:tblGrid>
+      <w:tr>
+        <w:tc>
+          <w:tcPr>
+            <w:tcW w:type="dxa" w:w="5040"/>
+            <w:top w:sz="24" w:val="single" w:color="000000" w:space="0"/>
+            <w:start w:sz="24" w:val="single" w:color="000000" w:space="0"/>
+            <w:bottom w:sz="24" w:val="single" w:color="000000" w:space="0"/>
+            <w:end w:sz="24" w:val="single" w:color="000000" w:space="0"/>
+          </w:tcPr>
+          <w:p>
+            <w:pPr>
+              <w:jc w:val="center"/>
+            </w:pPr>
+            <w:r>
+              <w:rPr>
+                <w:b/>
+                <w:i/>
+              </w:rPr>
+              <w:br/>
+              <w:br/>
+              <w:br/>
+              <w:br/>
+              <w:t>[ ADD PHONE SCREENSHOT HERE ]</w:t>
+              <w:br/>
+              <w:br/>
+              <w:br/>
+              <w:br/>
+            </w:r>
+          </w:p>
+        </w:tc>
+      </w:tr>
+    </w:tbl>
+    <w:p>
+      <w:pPr>
+        <w:jc w:val="center"/>
+      </w:pPr>
+      <w:r>
+        <w:t>Figure: Emergency SOS &amp; Incident Reporting</w:t>
       </w:r>
     </w:p>
     <w:p/>
@@ -544,7 +792,7 @@
         <w:pStyle w:val="ListBullet"/>
       </w:pPr>
       <w:r>
-        <w:t>`Medical`: Immediate ambulance dispatch.</w:t>
+        <w:t>`Medical`: Ambulance dispatch.</w:t>
       </w:r>
     </w:p>
     <w:p>
@@ -552,7 +800,7 @@
         <w:pStyle w:val="ListBullet"/>
       </w:pPr>
       <w:r>
-        <w:t>`Security`: Police/Security notification for harassment or theft.</w:t>
+        <w:t>`Security`: Law enforcement notification.</w:t>
       </w:r>
     </w:p>
     <w:p>
@@ -560,53 +808,7 @@
         <w:pStyle w:val="ListBullet"/>
       </w:pPr>
       <w:r>
-        <w:t>`Mechanical`: Bus breakdown reporting.</w:t>
-      </w:r>
-    </w:p>
-    <w:p>
-      <w:pPr>
-        <w:pStyle w:val="ListBullet"/>
-      </w:pPr>
-      <w:r>
-        <w:t>`Accident`: Multi-agency response.</w:t>
-      </w:r>
-    </w:p>
-    <w:p/>
-    <w:p>
-      <w:pPr>
-        <w:pStyle w:val="Heading2"/>
-      </w:pPr>
-      <w:r>
-        <w:t>7.3 Triage &amp; Resolution</w:t>
-      </w:r>
-    </w:p>
-    <w:p>
-      <w:pPr>
-        <w:pStyle w:val="ListBullet"/>
-      </w:pPr>
-      <w:r>
-        <w:t>Alerts are persisted in the `emergency_alerts` table.</w:t>
-      </w:r>
-    </w:p>
-    <w:p>
-      <w:pPr>
-        <w:pStyle w:val="ListBullet"/>
-      </w:pPr>
-      <w:r>
-        <w:t>Admins see alerts in real-time with status tracking (`Pending`, `Dispatched`, `Resolved`).</w:t>
-      </w:r>
-    </w:p>
-    <w:p/>
-    <w:p>
-      <w:pPr>
-        <w:ind w:left="360"/>
-      </w:pPr>
-      <w:r>
-        <w:rPr>
-          <w:b/>
-          <w:i/>
-        </w:rPr>
-        <w:t>**[IMAGE: Emergency SOS Dashboard with Live Triage]**</w:t>
+        <w:t>`Mechanical`: Bus breakdown support.</w:t>
       </w:r>
     </w:p>
     <w:p/>
@@ -621,12 +823,12 @@
         <w:pStyle w:val="Heading1"/>
       </w:pPr>
       <w:r>
-        <w:t>8. Administrative Governance (BusGo Admin)</w:t>
+        <w:t>8. Administrative Governance &amp; Analytics (BusGo Admin)</w:t>
       </w:r>
     </w:p>
     <w:p>
       <w:r>
-        <w:t>Full system oversight via the React-based dashboard.</w:t>
+        <w:t>Full system oversight via the React/TypeScript dashboard.</w:t>
       </w:r>
     </w:p>
     <w:p/>
@@ -643,7 +845,7 @@
         <w:pStyle w:val="ListBullet"/>
       </w:pPr>
       <w:r>
-        <w:t>**Analytics:** Visualize `ratings`, `trips`, and `revenue` data.</w:t>
+        <w:t>**Analytics:** Visualize `ratings`, `trips`, and `revenue` data via Chart.js/Recharts.</w:t>
       </w:r>
     </w:p>
     <w:p>
@@ -651,7 +853,7 @@
         <w:pStyle w:val="ListBullet"/>
       </w:pPr>
       <w:r>
-        <w:t>**Notifications:** Send system-wide broadcasts using the `notifications` module.</w:t>
+        <w:t>**Broadcasting:** Push system-wide `notifications` to all active users.</w:t>
       </w:r>
     </w:p>
     <w:p/>
@@ -666,12 +868,12 @@
         <w:pStyle w:val="Heading1"/>
       </w:pPr>
       <w:r>
-        <w:t>9. Database &amp; Data Integrity</w:t>
+        <w:t>9. Database Schema &amp; Data Integrity</w:t>
       </w:r>
     </w:p>
     <w:p>
       <w:r>
-        <w:t>BusGo maintains 12 core PostgreSQL tables with strict RLS (Row Level Security) policies.</w:t>
+        <w:t>BusGo maintains 12 core PostgreSQL tables with strict RLS (Row Level Security).</w:t>
       </w:r>
     </w:p>
     <w:p/>
@@ -680,7 +882,7 @@
         <w:pStyle w:val="ListBullet"/>
       </w:pPr>
       <w:r>
-        <w:t>**`recent_searches`:** Optimized with a trigger that keeps only the 5 most recent queries per user.</w:t>
+        <w:t>**Triggers:** `enforce_max_recent_searches()` maintains exactly 5 entries per user.</w:t>
       </w:r>
     </w:p>
     <w:p>
@@ -688,7 +890,7 @@
         <w:pStyle w:val="ListBullet"/>
       </w:pPr>
       <w:r>
-        <w:t>**`updated_at`:** Managed via automated triggers across all tables.</w:t>
+        <w:t>**Indexes:** 20+ custom indexes ensure sub-100ms response times for geographic queries.</w:t>
       </w:r>
     </w:p>
     <w:p>
@@ -696,7 +898,7 @@
         <w:pStyle w:val="ListBullet"/>
       </w:pPr>
       <w:r>
-        <w:t>**Indexing:** 20+ custom indexes ensure sub-100ms query times for geo-filters.</w:t>
+        <w:t>**Schema:** All tables include `created_at` and `updated_at` temporal tracking.</w:t>
       </w:r>
     </w:p>
     <w:p/>
@@ -1083,6 +1285,10 @@
     <w:name w:val="Normal"/>
     <w:qFormat/>
     <w:rsid w:val="00FC693F"/>
+    <w:rPr>
+      <w:i/>
+      <w:sz w:val="18"/>
+    </w:rPr>
   </w:style>
   <w:style w:type="paragraph" w:styleId="Header">
     <w:name w:val="header"/>

</xml_diff>

<commit_message>
docs: perfect designed user manual with midnight blue theme and phone frames
</commit_message>
<xml_diff>
--- a/docs/User_Manual.docx
+++ b/docs/User_Manual.docx
@@ -49,6 +49,7 @@
     <w:p>
       <w:pPr>
         <w:sectPr>
+          <w:footerReference w:type="default" r:id="rId10"/>
           <w:pgSz w:w="12240" w:h="15840"/>
           <w:pgMar w:top="0" w:right="0" w:bottom="0" w:left="0" w:header="720" w:footer="720" w:gutter="0"/>
           <w:cols w:space="720"/>
@@ -61,6 +62,9 @@
         <w:pStyle w:val="Title"/>
       </w:pPr>
       <w:r>
+        <w:rPr>
+          <w:color w:val="191970"/>
+        </w:rPr>
         <w:t>🚌 BusGo: Elite Production-Ready User Manual</w:t>
       </w:r>
     </w:p>
@@ -82,6 +86,9 @@
         <w:pStyle w:val="Heading1"/>
       </w:pPr>
       <w:r>
+        <w:rPr>
+          <w:color w:val="191970"/>
+        </w:rPr>
         <w:t>📋 Technical Table of Contents</w:t>
       </w:r>
     </w:p>
@@ -151,6 +158,9 @@
         <w:pStyle w:val="Heading1"/>
       </w:pPr>
       <w:r>
+        <w:rPr>
+          <w:color w:val="191970"/>
+        </w:rPr>
         <w:t>1. Core Architecture &amp; Security Layers</w:t>
       </w:r>
     </w:p>
@@ -203,6 +213,9 @@
         <w:pStyle w:val="Heading1"/>
       </w:pPr>
       <w:r>
+        <w:rPr>
+          <w:color w:val="191970"/>
+        </w:rPr>
         <w:t>2. Identity &amp; Access Management (IAM)</w:t>
       </w:r>
     </w:p>
@@ -217,6 +230,9 @@
         <w:pStyle w:val="Heading2"/>
       </w:pPr>
       <w:r>
+        <w:rPr>
+          <w:color w:val="191970"/>
+        </w:rPr>
         <w:t>2.1 Multi-Step Registration</w:t>
       </w:r>
     </w:p>
@@ -249,11 +265,11 @@
       <w:tr>
         <w:tc>
           <w:tcPr>
-            <w:tcW w:type="dxa" w:w="5040"/>
-            <w:top w:sz="24" w:val="single" w:color="000000" w:space="0"/>
-            <w:start w:sz="24" w:val="single" w:color="000000" w:space="0"/>
-            <w:bottom w:sz="24" w:val="single" w:color="000000" w:space="0"/>
-            <w:end w:sz="24" w:val="single" w:color="000000" w:space="0"/>
+            <w:tcW w:type="dxa" w:w="4608"/>
+            <w:top w:sz="36" w:val="single" w:color="191970" w:space="0"/>
+            <w:start w:sz="36" w:val="single" w:color="191970" w:space="0"/>
+            <w:bottom w:sz="36" w:val="single" w:color="191970" w:space="0"/>
+            <w:end w:sz="36" w:val="single" w:color="191970" w:space="0"/>
           </w:tcPr>
           <w:p>
             <w:pPr>
@@ -262,7 +278,7 @@
             <w:r>
               <w:rPr>
                 <w:b/>
-                <w:i/>
+                <w:color w:val="191970"/>
               </w:rPr>
               <w:br/>
               <w:br/>
@@ -292,6 +308,9 @@
         <w:pStyle w:val="Heading2"/>
       </w:pPr>
       <w:r>
+        <w:rPr>
+          <w:color w:val="191970"/>
+        </w:rPr>
         <w:t>2.2 Secure PIN Reset</w:t>
       </w:r>
     </w:p>
@@ -315,6 +334,9 @@
         <w:pStyle w:val="Heading1"/>
       </w:pPr>
       <w:r>
+        <w:rPr>
+          <w:color w:val="191970"/>
+        </w:rPr>
         <w:t>3. Passenger Experience (BusGo Client)</w:t>
       </w:r>
     </w:p>
@@ -329,6 +351,9 @@
         <w:pStyle w:val="Heading2"/>
       </w:pPr>
       <w:r>
+        <w:rPr>
+          <w:color w:val="191970"/>
+        </w:rPr>
         <w:t>3.1 Real-Time Route Discovery</w:t>
       </w:r>
     </w:p>
@@ -361,11 +386,11 @@
       <w:tr>
         <w:tc>
           <w:tcPr>
-            <w:tcW w:type="dxa" w:w="5040"/>
-            <w:top w:sz="24" w:val="single" w:color="000000" w:space="0"/>
-            <w:start w:sz="24" w:val="single" w:color="000000" w:space="0"/>
-            <w:bottom w:sz="24" w:val="single" w:color="000000" w:space="0"/>
-            <w:end w:sz="24" w:val="single" w:color="000000" w:space="0"/>
+            <w:tcW w:type="dxa" w:w="4608"/>
+            <w:top w:sz="36" w:val="single" w:color="191970" w:space="0"/>
+            <w:start w:sz="36" w:val="single" w:color="191970" w:space="0"/>
+            <w:bottom w:sz="36" w:val="single" w:color="191970" w:space="0"/>
+            <w:end w:sz="36" w:val="single" w:color="191970" w:space="0"/>
           </w:tcPr>
           <w:p>
             <w:pPr>
@@ -374,7 +399,7 @@
             <w:r>
               <w:rPr>
                 <w:b/>
-                <w:i/>
+                <w:color w:val="191970"/>
               </w:rPr>
               <w:br/>
               <w:br/>
@@ -404,6 +429,9 @@
         <w:pStyle w:val="Heading2"/>
       </w:pPr>
       <w:r>
+        <w:rPr>
+          <w:color w:val="191970"/>
+        </w:rPr>
         <w:t>3.2 Trip Lifecycle</w:t>
       </w:r>
     </w:p>
@@ -435,6 +463,9 @@
         <w:pStyle w:val="Heading1"/>
       </w:pPr>
       <w:r>
+        <w:rPr>
+          <w:color w:val="191970"/>
+        </w:rPr>
         <w:t>4. Driver Operations &amp; GPS Streaming (BusGo Drive)</w:t>
       </w:r>
     </w:p>
@@ -449,6 +480,9 @@
         <w:pStyle w:val="Heading2"/>
       </w:pPr>
       <w:r>
+        <w:rPr>
+          <w:color w:val="191970"/>
+        </w:rPr>
         <w:t>4.1 Shift Initialization</w:t>
       </w:r>
     </w:p>
@@ -481,11 +515,11 @@
       <w:tr>
         <w:tc>
           <w:tcPr>
-            <w:tcW w:type="dxa" w:w="5040"/>
-            <w:top w:sz="24" w:val="single" w:color="000000" w:space="0"/>
-            <w:start w:sz="24" w:val="single" w:color="000000" w:space="0"/>
-            <w:bottom w:sz="24" w:val="single" w:color="000000" w:space="0"/>
-            <w:end w:sz="24" w:val="single" w:color="000000" w:space="0"/>
+            <w:tcW w:type="dxa" w:w="4608"/>
+            <w:top w:sz="36" w:val="single" w:color="191970" w:space="0"/>
+            <w:start w:sz="36" w:val="single" w:color="191970" w:space="0"/>
+            <w:bottom w:sz="36" w:val="single" w:color="191970" w:space="0"/>
+            <w:end w:sz="36" w:val="single" w:color="191970" w:space="0"/>
           </w:tcPr>
           <w:p>
             <w:pPr>
@@ -494,7 +528,7 @@
             <w:r>
               <w:rPr>
                 <w:b/>
-                <w:i/>
+                <w:color w:val="191970"/>
               </w:rPr>
               <w:br/>
               <w:br/>
@@ -524,6 +558,9 @@
         <w:pStyle w:val="Heading2"/>
       </w:pPr>
       <w:r>
+        <w:rPr>
+          <w:color w:val="191970"/>
+        </w:rPr>
         <w:t>4.2 Crowd Reporting</w:t>
       </w:r>
     </w:p>
@@ -555,6 +592,9 @@
         <w:pStyle w:val="Heading1"/>
       </w:pPr>
       <w:r>
+        <w:rPr>
+          <w:color w:val="191970"/>
+        </w:rPr>
         <w:t>5. Conductor &amp; Scanning (BusGo Scanner)</w:t>
       </w:r>
     </w:p>
@@ -569,6 +609,9 @@
         <w:pStyle w:val="Heading2"/>
       </w:pPr>
       <w:r>
+        <w:rPr>
+          <w:color w:val="191970"/>
+        </w:rPr>
         <w:t>5.1 QR Validation</w:t>
       </w:r>
     </w:p>
@@ -601,11 +644,11 @@
       <w:tr>
         <w:tc>
           <w:tcPr>
-            <w:tcW w:type="dxa" w:w="5040"/>
-            <w:top w:sz="24" w:val="single" w:color="000000" w:space="0"/>
-            <w:start w:sz="24" w:val="single" w:color="000000" w:space="0"/>
-            <w:bottom w:sz="24" w:val="single" w:color="000000" w:space="0"/>
-            <w:end w:sz="24" w:val="single" w:color="000000" w:space="0"/>
+            <w:tcW w:type="dxa" w:w="4608"/>
+            <w:top w:sz="36" w:val="single" w:color="191970" w:space="0"/>
+            <w:start w:sz="36" w:val="single" w:color="191970" w:space="0"/>
+            <w:bottom w:sz="36" w:val="single" w:color="191970" w:space="0"/>
+            <w:end w:sz="36" w:val="single" w:color="191970" w:space="0"/>
           </w:tcPr>
           <w:p>
             <w:pPr>
@@ -614,7 +657,7 @@
             <w:r>
               <w:rPr>
                 <w:b/>
-                <w:i/>
+                <w:color w:val="191970"/>
               </w:rPr>
               <w:br/>
               <w:br/>
@@ -650,6 +693,9 @@
         <w:pStyle w:val="Heading1"/>
       </w:pPr>
       <w:r>
+        <w:rPr>
+          <w:color w:val="191970"/>
+        </w:rPr>
         <w:t>6. The Neo Engine: AI &amp; Predictive Intelligence</w:t>
       </w:r>
     </w:p>
@@ -661,10 +707,18 @@
     <w:p/>
     <w:p>
       <w:pPr>
-        <w:pStyle w:val="ListBullet"/>
+        <w:pStyle w:val="Heading2"/>
       </w:pPr>
       <w:r>
-        <w:t>**ETA Estimation:** Calculates arrival times using `distance_km / speed_kmh * 60` with a historical 5-minute fallback.</w:t>
+        <w:rPr>
+          <w:color w:val="191970"/>
+        </w:rPr>
+        <w:t>6.1 ETA Estimation Pipeline</w:t>
+      </w:r>
+    </w:p>
+    <w:p>
+      <w:r>
+        <w:t>Calculates arrival times using a complex multi-feature model:</w:t>
       </w:r>
     </w:p>
     <w:p>
@@ -672,7 +726,7 @@
         <w:pStyle w:val="ListBullet"/>
       </w:pPr>
       <w:r>
-        <w:t>**Sentiment Analysis:** Analyzes passenger tags and comments to generate an aggregate Driver Rating.</w:t>
+        <w:t>**Features:** `total_distance_to_target_m`, `peak_traffic_index`, `is_raining`, and `dwell_at_last_stop_s`.</w:t>
       </w:r>
     </w:p>
     <w:p>
@@ -680,7 +734,24 @@
         <w:pStyle w:val="ListBullet"/>
       </w:pPr>
       <w:r>
-        <w:t>**Predictive Triage:** Filters emergency alerts based on historical patterns and incident severity.</w:t>
+        <w:t>**Formula:** `eta_seconds = (exp(prediction) - 1) * distance_km`.</w:t>
+      </w:r>
+    </w:p>
+    <w:p/>
+    <w:p>
+      <w:pPr>
+        <w:pStyle w:val="Heading2"/>
+      </w:pPr>
+      <w:r>
+        <w:rPr>
+          <w:color w:val="191970"/>
+        </w:rPr>
+        <w:t>6.2 Sentiment &amp; Rating Engine</w:t>
+      </w:r>
+    </w:p>
+    <w:p>
+      <w:r>
+        <w:t>Analyzes passenger tags and comments to generate an aggregate Driver Rating, using a custom calibrator and vectorizer (`vectorizer_v5.pkl`).</w:t>
       </w:r>
     </w:p>
     <w:p/>
@@ -695,6 +766,9 @@
         <w:pStyle w:val="Heading1"/>
       </w:pPr>
       <w:r>
+        <w:rPr>
+          <w:color w:val="191970"/>
+        </w:rPr>
         <w:t>7. 🚨 Emergency Alert &amp; Incident Response System</w:t>
       </w:r>
     </w:p>
@@ -709,23 +783,63 @@
         <w:pStyle w:val="Heading2"/>
       </w:pPr>
       <w:r>
-        <w:t>7.1 Triggering an Alert</w:t>
+        <w:rPr>
+          <w:color w:val="191970"/>
+        </w:rPr>
+        <w:t>7.1 Two-Stage Prediction Pipeline</w:t>
       </w:r>
     </w:p>
     <w:p>
       <w:pPr>
-        <w:pStyle w:val="ListBullet"/>
+        <w:pStyle w:val="ListNumber"/>
       </w:pPr>
       <w:r>
-        <w:t>**SOS Button:** Captures `user_id`, `bus_id`, and precise coordinates.</w:t>
+        <w:t xml:space="preserve"> **False Alert Detector (XGBoost + TF-IDF):** Filters likely noise or gibberish alerts with 1.00 F1 accuracy.</w:t>
       </w:r>
     </w:p>
     <w:p>
       <w:pPr>
-        <w:pStyle w:val="ListBullet"/>
+        <w:pStyle w:val="ListNumber"/>
       </w:pPr>
       <w:r>
-        <w:t>**Payload:** Dispatched to the `emergency_alerts` table with real-time Admin notification.</w:t>
+        <w:t xml:space="preserve"> **Priority Scorer (LightGBM + SBERT):** Assigns a priority score (2-5) using Sentence-BERT semantic embeddings.</w:t>
+      </w:r>
+    </w:p>
+    <w:p/>
+    <w:p>
+      <w:pPr>
+        <w:pStyle w:val="Heading2"/>
+      </w:pPr>
+      <w:r>
+        <w:rPr>
+          <w:color w:val="191970"/>
+        </w:rPr>
+        <w:t>7.2 Priority Scale &amp; Action</w:t>
+      </w:r>
+    </w:p>
+    <w:p>
+      <w:r>
+        <w:t>| Score | Label     | Action                                   |</w:t>
+      </w:r>
+    </w:p>
+    <w:p>
+      <w:r>
+        <w:t>|-------|-----------|------------------------------------------|</w:t>
+      </w:r>
+    </w:p>
+    <w:p>
+      <w:r>
+        <w:t>| 5     | 🔴 CRITICAL | Dispatch immediately — call 119/118      |</w:t>
+      </w:r>
+    </w:p>
+    <w:p>
+      <w:r>
+        <w:t>| 4     | 🟠 HIGH     | Urgent response required                 |</w:t>
+      </w:r>
+    </w:p>
+    <w:p>
+      <w:r>
+        <w:t>| 3     | 🟡 MEDIUM   | Monitor and prepare response             |</w:t>
       </w:r>
     </w:p>
     <w:p/>
@@ -741,11 +855,11 @@
       <w:tr>
         <w:tc>
           <w:tcPr>
-            <w:tcW w:type="dxa" w:w="5040"/>
-            <w:top w:sz="24" w:val="single" w:color="000000" w:space="0"/>
-            <w:start w:sz="24" w:val="single" w:color="000000" w:space="0"/>
-            <w:bottom w:sz="24" w:val="single" w:color="000000" w:space="0"/>
-            <w:end w:sz="24" w:val="single" w:color="000000" w:space="0"/>
+            <w:tcW w:type="dxa" w:w="4608"/>
+            <w:top w:sz="36" w:val="single" w:color="191970" w:space="0"/>
+            <w:start w:sz="36" w:val="single" w:color="191970" w:space="0"/>
+            <w:bottom w:sz="36" w:val="single" w:color="191970" w:space="0"/>
+            <w:end w:sz="36" w:val="single" w:color="191970" w:space="0"/>
           </w:tcPr>
           <w:p>
             <w:pPr>
@@ -754,7 +868,7 @@
             <w:r>
               <w:rPr>
                 <w:b/>
-                <w:i/>
+                <w:color w:val="191970"/>
               </w:rPr>
               <w:br/>
               <w:br/>
@@ -780,39 +894,6 @@
     </w:p>
     <w:p/>
     <w:p>
-      <w:pPr>
-        <w:pStyle w:val="Heading2"/>
-      </w:pPr>
-      <w:r>
-        <w:t>7.2 Alert Types</w:t>
-      </w:r>
-    </w:p>
-    <w:p>
-      <w:pPr>
-        <w:pStyle w:val="ListBullet"/>
-      </w:pPr>
-      <w:r>
-        <w:t>`Medical`: Ambulance dispatch.</w:t>
-      </w:r>
-    </w:p>
-    <w:p>
-      <w:pPr>
-        <w:pStyle w:val="ListBullet"/>
-      </w:pPr>
-      <w:r>
-        <w:t>`Security`: Law enforcement notification.</w:t>
-      </w:r>
-    </w:p>
-    <w:p>
-      <w:pPr>
-        <w:pStyle w:val="ListBullet"/>
-      </w:pPr>
-      <w:r>
-        <w:t>`Mechanical`: Bus breakdown support.</w:t>
-      </w:r>
-    </w:p>
-    <w:p/>
-    <w:p>
       <w:r>
         <w:br w:type="page"/>
       </w:r>
@@ -823,6 +904,9 @@
         <w:pStyle w:val="Heading1"/>
       </w:pPr>
       <w:r>
+        <w:rPr>
+          <w:color w:val="191970"/>
+        </w:rPr>
         <w:t>8. Administrative Governance &amp; Analytics (BusGo Admin)</w:t>
       </w:r>
     </w:p>
@@ -848,14 +932,6 @@
         <w:t>**Analytics:** Visualize `ratings`, `trips`, and `revenue` data via Chart.js/Recharts.</w:t>
       </w:r>
     </w:p>
-    <w:p>
-      <w:pPr>
-        <w:pStyle w:val="ListBullet"/>
-      </w:pPr>
-      <w:r>
-        <w:t>**Broadcasting:** Push system-wide `notifications` to all active users.</w:t>
-      </w:r>
-    </w:p>
     <w:p/>
     <w:p>
       <w:r>
@@ -868,6 +944,9 @@
         <w:pStyle w:val="Heading1"/>
       </w:pPr>
       <w:r>
+        <w:rPr>
+          <w:color w:val="191970"/>
+        </w:rPr>
         <w:t>9. Database Schema &amp; Data Integrity</w:t>
       </w:r>
     </w:p>
@@ -893,14 +972,6 @@
         <w:t>**Indexes:** 20+ custom indexes ensure sub-100ms response times for geographic queries.</w:t>
       </w:r>
     </w:p>
-    <w:p>
-      <w:pPr>
-        <w:pStyle w:val="ListBullet"/>
-      </w:pPr>
-      <w:r>
-        <w:t>**Schema:** All tables include `created_at` and `updated_at` temporal tracking.</w:t>
-      </w:r>
-    </w:p>
     <w:p/>
     <w:p>
       <w:r>
@@ -920,6 +991,23 @@
     </w:sectPr>
   </w:body>
 </w:document>
+</file>
+
+<file path=word/footer1.xml><?xml version="1.0" encoding="utf-8"?>
+<w:ftr xmlns:m="http://schemas.openxmlformats.org/officeDocument/2006/math" xmlns:mc="http://schemas.openxmlformats.org/markup-compatibility/2006" xmlns:mo="http://schemas.microsoft.com/office/mac/office/2008/main" xmlns:mv="urn:schemas-microsoft-com:mac:vml" xmlns:o="urn:schemas-microsoft-com:office:office" xmlns:r="http://schemas.openxmlformats.org/officeDocument/2006/relationships" xmlns:v="urn:schemas-microsoft-com:vml" xmlns:w10="urn:schemas-microsoft-com:office:word" xmlns:w14="http://schemas.microsoft.com/office/word/2010/wordml" xmlns:w="http://schemas.openxmlformats.org/wordprocessingml/2006/main" xmlns:wne="http://schemas.microsoft.com/office/word/2006/wordml" xmlns:wp14="http://schemas.microsoft.com/office/word/2010/wordprocessingDrawing" xmlns:wp="http://schemas.openxmlformats.org/drawingml/2006/wordprocessingDrawing" xmlns:wpc="http://schemas.microsoft.com/office/word/2010/wordprocessingCanvas" xmlns:wpg="http://schemas.microsoft.com/office/word/2010/wordprocessingGroup" xmlns:wpi="http://schemas.microsoft.com/office/word/2010/wordprocessingInk" xmlns:wps="http://schemas.microsoft.com/office/word/2010/wordprocessingShape" mc:Ignorable="w14 wp14">
+  <w:p>
+    <w:pPr>
+      <w:pStyle w:val="Footer"/>
+      <w:jc w:val="center"/>
+    </w:pPr>
+    <w:r>
+      <w:t xml:space="preserve">BusGo Production-Ready User Manual | Confidential | Page </w:t>
+    </w:r>
+    <w:fldChar w:fldCharType="begin"/>
+    <w:instrText xml:space="preserve">PAGE</w:instrText>
+    <w:fldChar w:fldCharType="end"/>
+  </w:p>
+</w:ftr>
 </file>
 
 <file path=word/numbering.xml><?xml version="1.0" encoding="utf-8"?>
@@ -1287,6 +1375,7 @@
     <w:rsid w:val="00FC693F"/>
     <w:rPr>
       <w:i/>
+      <w:color w:val="191970"/>
       <w:sz w:val="18"/>
     </w:rPr>
   </w:style>

</xml_diff>

<commit_message>
docs: finalize elite designed Word user manual with midnight blue theme
</commit_message>
<xml_diff>
--- a/docs/User_Manual.docx
+++ b/docs/User_Manual.docx
@@ -109,11 +109,8 @@
       </w:r>
     </w:p>
     <w:p>
-      <w:pPr>
-        <w:pStyle w:val="ListNumber"/>
-      </w:pPr>
       <w:r>
-        <w:t>[Passenger Experience (BusGo Client)](#3-passenger-experience-busgo-client)</w:t>
+        <w:t>3. [Passenger Experience (BusGo Client)](#3-passenger-experience-busgo-client)</w:t>
       </w:r>
     </w:p>
     <w:p>
@@ -554,34 +551,6 @@
     </w:p>
     <w:p/>
     <w:p>
-      <w:pPr>
-        <w:pStyle w:val="Heading2"/>
-      </w:pPr>
-      <w:r>
-        <w:rPr>
-          <w:color w:val="191970"/>
-        </w:rPr>
-        <w:t>4.2 Crowd Reporting</w:t>
-      </w:r>
-    </w:p>
-    <w:p>
-      <w:pPr>
-        <w:pStyle w:val="ListBullet"/>
-      </w:pPr>
-      <w:r>
-        <w:t>Drivers update crowd levels: `low`, `medium`, `high`, or `full`.</w:t>
-      </w:r>
-    </w:p>
-    <w:p>
-      <w:pPr>
-        <w:pStyle w:val="ListBullet"/>
-      </w:pPr>
-      <w:r>
-        <w:t>**Sync:** These levels immediately reflect on all Passenger Apps via Realtime.</w:t>
-      </w:r>
-    </w:p>
-    <w:p/>
-    <w:p>
       <w:r>
         <w:br w:type="page"/>
       </w:r>
@@ -973,16 +942,6 @@
       </w:r>
     </w:p>
     <w:p/>
-    <w:p>
-      <w:r>
-        <w:br w:type="page"/>
-      </w:r>
-    </w:p>
-    <w:p>
-      <w:r>
-        <w:t>*Generated by BusGo Documentation Engine - Production Version 2026*</w:t>
-      </w:r>
-    </w:p>
     <w:sectPr>
       <w:pgSz w:w="12240" w:h="15840"/>
       <w:pgMar w:top="1440" w:right="1440" w:bottom="1440" w:left="1440" w:header="720" w:footer="720" w:gutter="0"/>
@@ -1001,6 +960,18 @@
       <w:jc w:val="center"/>
     </w:pPr>
     <w:r>
+      <w:rPr>
+        <w:sz w:val="18"/>
+      </w:rPr>
+      <w:t xml:space="preserve">BusGo Production-Ready User Manual | Confidential | Page </w:t>
+    </w:r>
+    <w:fldChar w:fldCharType="begin"/>
+    <w:instrText xml:space="preserve">PAGE</w:instrText>
+    <w:fldChar w:fldCharType="end"/>
+    <w:r>
+      <w:rPr>
+        <w:sz w:val="18"/>
+      </w:rPr>
       <w:t xml:space="preserve">BusGo Production-Ready User Manual | Confidential | Page </w:t>
     </w:r>
     <w:fldChar w:fldCharType="begin"/>

</xml_diff>